<commit_message>
Add extras: confusion heatmaps, architecture diagram, length-bias, accuracy
Stage F (stage_f_extras.py) produces four report assets, all on the same
all-sets split as the BiLSTM:
- F1 per-set agreement (confusion) heatmaps
- F2 length-bias analysis: BiLSTM length-correlation (+0.76) sits closer to the
  human score (+0.68) than the length-driven baseline (+0.87) -> less biased
- F3 workflow + model-architecture diagram (fills the report's diagram slot)
- exact/adjacent agreement accuracy (mean 49.2% / 81.4%)

Report regenerated with these figures, an accuracy table, and new subsections
3.4-3.6 (heatmaps, accuracy, length-bias ethics). RESULTS.md updated.

Co-Authored-By: Claude Opus 4.8 (1M context) <noreply@anthropic.com>
</commit_message>
<xml_diff>
--- a/AES_Microproject_Report.docx
+++ b/AES_Microproject_Report.docx
@@ -537,6 +537,58 @@
     </w:p>
     <w:p>
       <w:pPr>
+        <w:jc w:val="center"/>
+      </w:pPr>
+      <w:r>
+        <w:drawing>
+          <wp:inline xmlns:a="http://schemas.openxmlformats.org/drawingml/2006/main" xmlns:pic="http://schemas.openxmlformats.org/drawingml/2006/picture">
+            <wp:extent cx="5486400" cy="4114800"/>
+            <wp:docPr id="1" name="Picture 1"/>
+            <wp:cNvGraphicFramePr>
+              <a:graphicFrameLocks noChangeAspect="1"/>
+            </wp:cNvGraphicFramePr>
+            <a:graphic>
+              <a:graphicData uri="http://schemas.openxmlformats.org/drawingml/2006/picture">
+                <pic:pic>
+                  <pic:nvPicPr>
+                    <pic:cNvPr id="0" name="F3_architecture.png"/>
+                    <pic:cNvPicPr/>
+                  </pic:nvPicPr>
+                  <pic:blipFill>
+                    <a:blip r:embed="rId10"/>
+                    <a:stretch>
+                      <a:fillRect/>
+                    </a:stretch>
+                  </pic:blipFill>
+                  <pic:spPr>
+                    <a:xfrm>
+                      <a:off x="0" y="0"/>
+                      <a:ext cx="5486400" cy="4114800"/>
+                    </a:xfrm>
+                    <a:prstGeom prst="rect"/>
+                  </pic:spPr>
+                </pic:pic>
+              </a:graphicData>
+            </a:graphic>
+          </wp:inline>
+        </w:drawing>
+      </w:r>
+    </w:p>
+    <w:p>
+      <w:pPr>
+        <w:spacing w:after="240"/>
+        <w:jc w:val="center"/>
+      </w:pPr>
+      <w:r>
+        <w:rPr>
+          <w:i/>
+          <w:sz w:val="19"/>
+        </w:rPr>
+        <w:t>Figure A: End-to-end workflow (top) and BiLSTM model architecture (bottom).</w:t>
+      </w:r>
+    </w:p>
+    <w:p>
+      <w:pPr>
         <w:spacing w:before="280" w:after="120"/>
       </w:pPr>
       <w:r>
@@ -673,7 +725,7 @@
         <w:drawing>
           <wp:inline xmlns:a="http://schemas.openxmlformats.org/drawingml/2006/main" xmlns:pic="http://schemas.openxmlformats.org/drawingml/2006/picture">
             <wp:extent cx="5669280" cy="3543300"/>
-            <wp:docPr id="1" name="Picture 1"/>
+            <wp:docPr id="2" name="Picture 2"/>
             <wp:cNvGraphicFramePr>
               <a:graphicFrameLocks noChangeAspect="1"/>
             </wp:cNvGraphicFramePr>
@@ -685,7 +737,7 @@
                     <pic:cNvPicPr/>
                   </pic:nvPicPr>
                   <pic:blipFill>
-                    <a:blip r:embed="rId10"/>
+                    <a:blip r:embed="rId11"/>
                     <a:stretch>
                       <a:fillRect/>
                     </a:stretch>
@@ -725,7 +777,7 @@
         <w:drawing>
           <wp:inline xmlns:a="http://schemas.openxmlformats.org/drawingml/2006/main" xmlns:pic="http://schemas.openxmlformats.org/drawingml/2006/picture">
             <wp:extent cx="5669280" cy="3149600"/>
-            <wp:docPr id="2" name="Picture 2"/>
+            <wp:docPr id="3" name="Picture 3"/>
             <wp:cNvGraphicFramePr>
               <a:graphicFrameLocks noChangeAspect="1"/>
             </wp:cNvGraphicFramePr>
@@ -737,7 +789,7 @@
                     <pic:cNvPicPr/>
                   </pic:nvPicPr>
                   <pic:blipFill>
-                    <a:blip r:embed="rId11"/>
+                    <a:blip r:embed="rId12"/>
                     <a:stretch>
                       <a:fillRect/>
                     </a:stretch>
@@ -777,7 +829,7 @@
         <w:drawing>
           <wp:inline xmlns:a="http://schemas.openxmlformats.org/drawingml/2006/main" xmlns:pic="http://schemas.openxmlformats.org/drawingml/2006/picture">
             <wp:extent cx="5669280" cy="3149600"/>
-            <wp:docPr id="3" name="Picture 3"/>
+            <wp:docPr id="4" name="Picture 4"/>
             <wp:cNvGraphicFramePr>
               <a:graphicFrameLocks noChangeAspect="1"/>
             </wp:cNvGraphicFramePr>
@@ -789,7 +841,7 @@
                     <pic:cNvPicPr/>
                   </pic:nvPicPr>
                   <pic:blipFill>
-                    <a:blip r:embed="rId12"/>
+                    <a:blip r:embed="rId13"/>
                     <a:stretch>
                       <a:fillRect/>
                     </a:stretch>
@@ -1997,7 +2049,7 @@
         <w:drawing>
           <wp:inline xmlns:a="http://schemas.openxmlformats.org/drawingml/2006/main" xmlns:pic="http://schemas.openxmlformats.org/drawingml/2006/picture">
             <wp:extent cx="5669280" cy="3092335"/>
-            <wp:docPr id="4" name="Picture 4"/>
+            <wp:docPr id="5" name="Picture 5"/>
             <wp:cNvGraphicFramePr>
               <a:graphicFrameLocks noChangeAspect="1"/>
             </wp:cNvGraphicFramePr>
@@ -2009,7 +2061,7 @@
                     <pic:cNvPicPr/>
                   </pic:nvPicPr>
                   <pic:blipFill>
-                    <a:blip r:embed="rId13"/>
+                    <a:blip r:embed="rId14"/>
                     <a:stretch>
                       <a:fillRect/>
                     </a:stretch>
@@ -2049,7 +2101,7 @@
         <w:drawing>
           <wp:inline xmlns:a="http://schemas.openxmlformats.org/drawingml/2006/main" xmlns:pic="http://schemas.openxmlformats.org/drawingml/2006/picture">
             <wp:extent cx="5669280" cy="2180492"/>
-            <wp:docPr id="5" name="Picture 5"/>
+            <wp:docPr id="6" name="Picture 6"/>
             <wp:cNvGraphicFramePr>
               <a:graphicFrameLocks noChangeAspect="1"/>
             </wp:cNvGraphicFramePr>
@@ -2061,7 +2113,7 @@
                     <pic:cNvPicPr/>
                   </pic:nvPicPr>
                   <pic:blipFill>
-                    <a:blip r:embed="rId14"/>
+                    <a:blip r:embed="rId15"/>
                     <a:stretch>
                       <a:fillRect/>
                     </a:stretch>
@@ -2115,7 +2167,7 @@
         <w:drawing>
           <wp:inline xmlns:a="http://schemas.openxmlformats.org/drawingml/2006/main" xmlns:pic="http://schemas.openxmlformats.org/drawingml/2006/picture">
             <wp:extent cx="5669280" cy="2616591"/>
-            <wp:docPr id="6" name="Picture 6"/>
+            <wp:docPr id="7" name="Picture 7"/>
             <wp:cNvGraphicFramePr>
               <a:graphicFrameLocks noChangeAspect="1"/>
             </wp:cNvGraphicFramePr>
@@ -2127,7 +2179,7 @@
                     <pic:cNvPicPr/>
                   </pic:nvPicPr>
                   <pic:blipFill>
-                    <a:blip r:embed="rId15"/>
+                    <a:blip r:embed="rId16"/>
                     <a:stretch>
                       <a:fillRect/>
                     </a:stretch>
@@ -2167,7 +2219,7 @@
         <w:drawing>
           <wp:inline xmlns:a="http://schemas.openxmlformats.org/drawingml/2006/main" xmlns:pic="http://schemas.openxmlformats.org/drawingml/2006/picture">
             <wp:extent cx="5669280" cy="2834640"/>
-            <wp:docPr id="7" name="Picture 7"/>
+            <wp:docPr id="8" name="Picture 8"/>
             <wp:cNvGraphicFramePr>
               <a:graphicFrameLocks noChangeAspect="1"/>
             </wp:cNvGraphicFramePr>
@@ -2179,7 +2231,7 @@
                     <pic:cNvPicPr/>
                   </pic:nvPicPr>
                   <pic:blipFill>
-                    <a:blip r:embed="rId16"/>
+                    <a:blip r:embed="rId17"/>
                     <a:stretch>
                       <a:fillRect/>
                     </a:stretch>
@@ -2209,6 +2261,621 @@
           <w:sz w:val="19"/>
         </w:rPr>
         <w:t>Figure 7: BiLSTM predicted vs actual, per set, with QWK annotated.</w:t>
+      </w:r>
+    </w:p>
+    <w:p>
+      <w:pPr>
+        <w:spacing w:after="160"/>
+      </w:pPr>
+      <w:r>
+        <w:rPr>
+          <w:b/>
+          <w:i w:val="0"/>
+          <w:sz w:val="22"/>
+        </w:rPr>
+        <w:t>3.4 Agreement (Confusion) Heatmaps</w:t>
+      </w:r>
+    </w:p>
+    <w:p>
+      <w:pPr>
+        <w:spacing w:after="160"/>
+        <w:jc w:val="both"/>
+      </w:pPr>
+      <w:r>
+        <w:rPr>
+          <w:b w:val="0"/>
+          <w:i w:val="0"/>
+          <w:sz w:val="22"/>
+        </w:rPr>
+        <w:t>Figure 8 shows, for each prompt, a heatmap of actual versus predicted score. Most of the mass lies on or immediately next to the diagonal, confirming that when the model is wrong it is usually wrong by only one point rather than badly mis-scoring. The wide-scale prompts (Sets 7 and 8) show a diagonal band rather than exact cells, which is expected on a 0-30 or 0-60 scale.</w:t>
+      </w:r>
+    </w:p>
+    <w:p>
+      <w:pPr>
+        <w:jc w:val="center"/>
+      </w:pPr>
+      <w:r>
+        <w:drawing>
+          <wp:inline xmlns:a="http://schemas.openxmlformats.org/drawingml/2006/main" xmlns:pic="http://schemas.openxmlformats.org/drawingml/2006/picture">
+            <wp:extent cx="5669280" cy="2834640"/>
+            <wp:docPr id="9" name="Picture 9"/>
+            <wp:cNvGraphicFramePr>
+              <a:graphicFrameLocks noChangeAspect="1"/>
+            </wp:cNvGraphicFramePr>
+            <a:graphic>
+              <a:graphicData uri="http://schemas.openxmlformats.org/drawingml/2006/picture">
+                <pic:pic>
+                  <pic:nvPicPr>
+                    <pic:cNvPr id="0" name="F1_confusion_heatmaps.png"/>
+                    <pic:cNvPicPr/>
+                  </pic:nvPicPr>
+                  <pic:blipFill>
+                    <a:blip r:embed="rId18"/>
+                    <a:stretch>
+                      <a:fillRect/>
+                    </a:stretch>
+                  </pic:blipFill>
+                  <pic:spPr>
+                    <a:xfrm>
+                      <a:off x="0" y="0"/>
+                      <a:ext cx="5669280" cy="2834640"/>
+                    </a:xfrm>
+                    <a:prstGeom prst="rect"/>
+                  </pic:spPr>
+                </pic:pic>
+              </a:graphicData>
+            </a:graphic>
+          </wp:inline>
+        </w:drawing>
+      </w:r>
+    </w:p>
+    <w:p>
+      <w:pPr>
+        <w:spacing w:after="240"/>
+        <w:jc w:val="center"/>
+      </w:pPr>
+      <w:r>
+        <w:rPr>
+          <w:i/>
+          <w:sz w:val="19"/>
+        </w:rPr>
+        <w:t>Figure 8: Per-set agreement heatmaps (actual vs predicted); the red line is perfect agreement.</w:t>
+      </w:r>
+    </w:p>
+    <w:p>
+      <w:pPr>
+        <w:spacing w:after="160"/>
+      </w:pPr>
+      <w:r>
+        <w:rPr>
+          <w:b/>
+          <w:i w:val="0"/>
+          <w:sz w:val="22"/>
+        </w:rPr>
+        <w:t>3.5 Exact and Adjacent Agreement Accuracy</w:t>
+      </w:r>
+    </w:p>
+    <w:p>
+      <w:pPr>
+        <w:spacing w:after="160"/>
+        <w:jc w:val="both"/>
+      </w:pPr>
+      <w:r>
+        <w:rPr>
+          <w:b w:val="0"/>
+          <w:i w:val="0"/>
+          <w:sz w:val="22"/>
+        </w:rPr>
+        <w:t>Although essay scoring is a regression task (so RMSE, MAE and QWK are the primary metrics), two accuracy-style measures are also informative: exact agreement (predicted score equals the human score) and adjacent agreement (within one point). Across all prompts the BiLSTM reaches 49.2% exact and 81.4% adjacent agreement. These are reported as secondary, scale-dependent metrics: on narrow scales (Sets 2-6) adjacent agreement is 97-100%, whereas on the 0-60 scale of Set 8 a one-point tolerance is far stricter, which is exactly why the scale-aware QWK remains the primary metric.</w:t>
+      </w:r>
+    </w:p>
+    <w:tbl>
+      <w:tblPr>
+        <w:tblStyle w:val="LightGrid-Accent1"/>
+        <w:tblW w:type="auto" w:w="0"/>
+        <w:tblLook w:firstColumn="1" w:firstRow="1" w:lastColumn="0" w:lastRow="0" w:noHBand="0" w:noVBand="1" w:val="04A0"/>
+      </w:tblPr>
+      <w:tblGrid>
+        <w:gridCol w:w="2880"/>
+        <w:gridCol w:w="2880"/>
+        <w:gridCol w:w="2880"/>
+      </w:tblGrid>
+      <w:tr>
+        <w:tc>
+          <w:tcPr>
+            <w:tcW w:type="dxa" w:w="2880"/>
+          </w:tcPr>
+          <w:p>
+            <w:r>
+              <w:rPr>
+                <w:b/>
+                <w:sz w:val="20"/>
+              </w:rPr>
+              <w:t>Set</w:t>
+            </w:r>
+          </w:p>
+        </w:tc>
+        <w:tc>
+          <w:tcPr>
+            <w:tcW w:type="dxa" w:w="2880"/>
+          </w:tcPr>
+          <w:p>
+            <w:r>
+              <w:rPr>
+                <w:b/>
+                <w:sz w:val="20"/>
+              </w:rPr>
+              <w:t>Exact agreement</w:t>
+            </w:r>
+          </w:p>
+        </w:tc>
+        <w:tc>
+          <w:tcPr>
+            <w:tcW w:type="dxa" w:w="2880"/>
+          </w:tcPr>
+          <w:p>
+            <w:r>
+              <w:rPr>
+                <w:b/>
+                <w:sz w:val="20"/>
+              </w:rPr>
+              <w:t>Adjacent (within 1)</w:t>
+            </w:r>
+          </w:p>
+        </w:tc>
+      </w:tr>
+      <w:tr>
+        <w:tc>
+          <w:tcPr>
+            <w:tcW w:type="dxa" w:w="2880"/>
+          </w:tcPr>
+          <w:p>
+            <w:r>
+              <w:rPr>
+                <w:sz w:val="20"/>
+              </w:rPr>
+              <w:t>1</w:t>
+            </w:r>
+          </w:p>
+        </w:tc>
+        <w:tc>
+          <w:tcPr>
+            <w:tcW w:type="dxa" w:w="2880"/>
+          </w:tcPr>
+          <w:p>
+            <w:r>
+              <w:rPr>
+                <w:sz w:val="20"/>
+              </w:rPr>
+              <w:t>45.5%</w:t>
+            </w:r>
+          </w:p>
+        </w:tc>
+        <w:tc>
+          <w:tcPr>
+            <w:tcW w:type="dxa" w:w="2880"/>
+          </w:tcPr>
+          <w:p>
+            <w:r>
+              <w:rPr>
+                <w:sz w:val="20"/>
+              </w:rPr>
+              <w:t>86.6%</w:t>
+            </w:r>
+          </w:p>
+        </w:tc>
+      </w:tr>
+      <w:tr>
+        <w:tc>
+          <w:tcPr>
+            <w:tcW w:type="dxa" w:w="2880"/>
+          </w:tcPr>
+          <w:p>
+            <w:r>
+              <w:rPr>
+                <w:sz w:val="20"/>
+              </w:rPr>
+              <w:t>2</w:t>
+            </w:r>
+          </w:p>
+        </w:tc>
+        <w:tc>
+          <w:tcPr>
+            <w:tcW w:type="dxa" w:w="2880"/>
+          </w:tcPr>
+          <w:p>
+            <w:r>
+              <w:rPr>
+                <w:sz w:val="20"/>
+              </w:rPr>
+              <w:t>62.2%</w:t>
+            </w:r>
+          </w:p>
+        </w:tc>
+        <w:tc>
+          <w:tcPr>
+            <w:tcW w:type="dxa" w:w="2880"/>
+          </w:tcPr>
+          <w:p>
+            <w:r>
+              <w:rPr>
+                <w:sz w:val="20"/>
+              </w:rPr>
+              <w:t>99.3%</w:t>
+            </w:r>
+          </w:p>
+        </w:tc>
+      </w:tr>
+      <w:tr>
+        <w:tc>
+          <w:tcPr>
+            <w:tcW w:type="dxa" w:w="2880"/>
+          </w:tcPr>
+          <w:p>
+            <w:r>
+              <w:rPr>
+                <w:sz w:val="20"/>
+              </w:rPr>
+              <w:t>3</w:t>
+            </w:r>
+          </w:p>
+        </w:tc>
+        <w:tc>
+          <w:tcPr>
+            <w:tcW w:type="dxa" w:w="2880"/>
+          </w:tcPr>
+          <w:p>
+            <w:r>
+              <w:rPr>
+                <w:sz w:val="20"/>
+              </w:rPr>
+              <w:t>67.6%</w:t>
+            </w:r>
+          </w:p>
+        </w:tc>
+        <w:tc>
+          <w:tcPr>
+            <w:tcW w:type="dxa" w:w="2880"/>
+          </w:tcPr>
+          <w:p>
+            <w:r>
+              <w:rPr>
+                <w:sz w:val="20"/>
+              </w:rPr>
+              <w:t>96.9%</w:t>
+            </w:r>
+          </w:p>
+        </w:tc>
+      </w:tr>
+      <w:tr>
+        <w:tc>
+          <w:tcPr>
+            <w:tcW w:type="dxa" w:w="2880"/>
+          </w:tcPr>
+          <w:p>
+            <w:r>
+              <w:rPr>
+                <w:sz w:val="20"/>
+              </w:rPr>
+              <w:t>4</w:t>
+            </w:r>
+          </w:p>
+        </w:tc>
+        <w:tc>
+          <w:tcPr>
+            <w:tcW w:type="dxa" w:w="2880"/>
+          </w:tcPr>
+          <w:p>
+            <w:r>
+              <w:rPr>
+                <w:sz w:val="20"/>
+              </w:rPr>
+              <w:t>65.3%</w:t>
+            </w:r>
+          </w:p>
+        </w:tc>
+        <w:tc>
+          <w:tcPr>
+            <w:tcW w:type="dxa" w:w="2880"/>
+          </w:tcPr>
+          <w:p>
+            <w:r>
+              <w:rPr>
+                <w:sz w:val="20"/>
+              </w:rPr>
+              <w:t>100.0%</w:t>
+            </w:r>
+          </w:p>
+        </w:tc>
+      </w:tr>
+      <w:tr>
+        <w:tc>
+          <w:tcPr>
+            <w:tcW w:type="dxa" w:w="2880"/>
+          </w:tcPr>
+          <w:p>
+            <w:r>
+              <w:rPr>
+                <w:sz w:val="20"/>
+              </w:rPr>
+              <w:t>5</w:t>
+            </w:r>
+          </w:p>
+        </w:tc>
+        <w:tc>
+          <w:tcPr>
+            <w:tcW w:type="dxa" w:w="2880"/>
+          </w:tcPr>
+          <w:p>
+            <w:r>
+              <w:rPr>
+                <w:sz w:val="20"/>
+              </w:rPr>
+              <w:t>66.0%</w:t>
+            </w:r>
+          </w:p>
+        </w:tc>
+        <w:tc>
+          <w:tcPr>
+            <w:tcW w:type="dxa" w:w="2880"/>
+          </w:tcPr>
+          <w:p>
+            <w:r>
+              <w:rPr>
+                <w:sz w:val="20"/>
+              </w:rPr>
+              <w:t>99.3%</w:t>
+            </w:r>
+          </w:p>
+        </w:tc>
+      </w:tr>
+      <w:tr>
+        <w:tc>
+          <w:tcPr>
+            <w:tcW w:type="dxa" w:w="2880"/>
+          </w:tcPr>
+          <w:p>
+            <w:r>
+              <w:rPr>
+                <w:sz w:val="20"/>
+              </w:rPr>
+              <w:t>6</w:t>
+            </w:r>
+          </w:p>
+        </w:tc>
+        <w:tc>
+          <w:tcPr>
+            <w:tcW w:type="dxa" w:w="2880"/>
+          </w:tcPr>
+          <w:p>
+            <w:r>
+              <w:rPr>
+                <w:sz w:val="20"/>
+              </w:rPr>
+              <w:t>64.8%</w:t>
+            </w:r>
+          </w:p>
+        </w:tc>
+        <w:tc>
+          <w:tcPr>
+            <w:tcW w:type="dxa" w:w="2880"/>
+          </w:tcPr>
+          <w:p>
+            <w:r>
+              <w:rPr>
+                <w:sz w:val="20"/>
+              </w:rPr>
+              <w:t>98.9%</w:t>
+            </w:r>
+          </w:p>
+        </w:tc>
+      </w:tr>
+      <w:tr>
+        <w:tc>
+          <w:tcPr>
+            <w:tcW w:type="dxa" w:w="2880"/>
+          </w:tcPr>
+          <w:p>
+            <w:r>
+              <w:rPr>
+                <w:sz w:val="20"/>
+              </w:rPr>
+              <w:t>7</w:t>
+            </w:r>
+          </w:p>
+        </w:tc>
+        <w:tc>
+          <w:tcPr>
+            <w:tcW w:type="dxa" w:w="2880"/>
+          </w:tcPr>
+          <w:p>
+            <w:r>
+              <w:rPr>
+                <w:sz w:val="20"/>
+              </w:rPr>
+              <w:t>14.0%</w:t>
+            </w:r>
+          </w:p>
+        </w:tc>
+        <w:tc>
+          <w:tcPr>
+            <w:tcW w:type="dxa" w:w="2880"/>
+          </w:tcPr>
+          <w:p>
+            <w:r>
+              <w:rPr>
+                <w:sz w:val="20"/>
+              </w:rPr>
+              <w:t>42.1%</w:t>
+            </w:r>
+          </w:p>
+        </w:tc>
+      </w:tr>
+      <w:tr>
+        <w:tc>
+          <w:tcPr>
+            <w:tcW w:type="dxa" w:w="2880"/>
+          </w:tcPr>
+          <w:p>
+            <w:r>
+              <w:rPr>
+                <w:sz w:val="20"/>
+              </w:rPr>
+              <w:t>8</w:t>
+            </w:r>
+          </w:p>
+        </w:tc>
+        <w:tc>
+          <w:tcPr>
+            <w:tcW w:type="dxa" w:w="2880"/>
+          </w:tcPr>
+          <w:p>
+            <w:r>
+              <w:rPr>
+                <w:sz w:val="20"/>
+              </w:rPr>
+              <w:t>8.3%</w:t>
+            </w:r>
+          </w:p>
+        </w:tc>
+        <w:tc>
+          <w:tcPr>
+            <w:tcW w:type="dxa" w:w="2880"/>
+          </w:tcPr>
+          <w:p>
+            <w:r>
+              <w:rPr>
+                <w:sz w:val="20"/>
+              </w:rPr>
+              <w:t>28.4%</w:t>
+            </w:r>
+          </w:p>
+        </w:tc>
+      </w:tr>
+      <w:tr>
+        <w:tc>
+          <w:tcPr>
+            <w:tcW w:type="dxa" w:w="2880"/>
+          </w:tcPr>
+          <w:p>
+            <w:r>
+              <w:rPr>
+                <w:sz w:val="20"/>
+              </w:rPr>
+              <w:t>Mean</w:t>
+            </w:r>
+          </w:p>
+        </w:tc>
+        <w:tc>
+          <w:tcPr>
+            <w:tcW w:type="dxa" w:w="2880"/>
+          </w:tcPr>
+          <w:p>
+            <w:r>
+              <w:rPr>
+                <w:sz w:val="20"/>
+              </w:rPr>
+              <w:t>49.2%</w:t>
+            </w:r>
+          </w:p>
+        </w:tc>
+        <w:tc>
+          <w:tcPr>
+            <w:tcW w:type="dxa" w:w="2880"/>
+          </w:tcPr>
+          <w:p>
+            <w:r>
+              <w:rPr>
+                <w:sz w:val="20"/>
+              </w:rPr>
+              <w:t>81.4%</w:t>
+            </w:r>
+          </w:p>
+        </w:tc>
+      </w:tr>
+    </w:tbl>
+    <w:p>
+      <w:pPr>
+        <w:spacing w:after="80"/>
+      </w:pPr>
+    </w:p>
+    <w:p>
+      <w:pPr>
+        <w:spacing w:after="160"/>
+      </w:pPr>
+      <w:r>
+        <w:rPr>
+          <w:b/>
+          <w:i w:val="0"/>
+          <w:sz w:val="22"/>
+        </w:rPr>
+        <w:t>3.6 Length-Bias Analysis (Ethical Consideration)</w:t>
+      </w:r>
+    </w:p>
+    <w:p>
+      <w:pPr>
+        <w:spacing w:after="160"/>
+        <w:jc w:val="both"/>
+      </w:pPr>
+      <w:r>
+        <w:rPr>
+          <w:b w:val="0"/>
+          <w:i w:val="0"/>
+          <w:sz w:val="22"/>
+        </w:rPr>
+        <w:t>A key ethical concern in AES is a model rewarding sheer essay length instead of genuine quality. To test this, we measured how strongly each model's predicted score correlates with essay length, and compared it with how strongly the HUMAN score does. Averaged over all prompts, the human score correlates with length at +0.68. The handcrafted baseline over-relies on length at +0.87 — unsurprising, since its dominant feature is word count. The BiLSTM sits at +0.76, closer to the human level, providing evidence that it is measurably less length-biased than the baseline and is reading content, not just counting words (Figure 9).</w:t>
+      </w:r>
+    </w:p>
+    <w:p>
+      <w:pPr>
+        <w:jc w:val="center"/>
+      </w:pPr>
+      <w:r>
+        <w:drawing>
+          <wp:inline xmlns:a="http://schemas.openxmlformats.org/drawingml/2006/main" xmlns:pic="http://schemas.openxmlformats.org/drawingml/2006/picture">
+            <wp:extent cx="5669280" cy="2834640"/>
+            <wp:docPr id="10" name="Picture 10"/>
+            <wp:cNvGraphicFramePr>
+              <a:graphicFrameLocks noChangeAspect="1"/>
+            </wp:cNvGraphicFramePr>
+            <a:graphic>
+              <a:graphicData uri="http://schemas.openxmlformats.org/drawingml/2006/picture">
+                <pic:pic>
+                  <pic:nvPicPr>
+                    <pic:cNvPr id="0" name="F2_length_bias.png"/>
+                    <pic:cNvPicPr/>
+                  </pic:nvPicPr>
+                  <pic:blipFill>
+                    <a:blip r:embed="rId19"/>
+                    <a:stretch>
+                      <a:fillRect/>
+                    </a:stretch>
+                  </pic:blipFill>
+                  <pic:spPr>
+                    <a:xfrm>
+                      <a:off x="0" y="0"/>
+                      <a:ext cx="5669280" cy="2834640"/>
+                    </a:xfrm>
+                    <a:prstGeom prst="rect"/>
+                  </pic:spPr>
+                </pic:pic>
+              </a:graphicData>
+            </a:graphic>
+          </wp:inline>
+        </w:drawing>
+      </w:r>
+    </w:p>
+    <w:p>
+      <w:pPr>
+        <w:spacing w:after="240"/>
+        <w:jc w:val="center"/>
+      </w:pPr>
+      <w:r>
+        <w:rPr>
+          <w:i/>
+          <w:sz w:val="19"/>
+        </w:rPr>
+        <w:t>Figure 9: Correlation of essay length with score, per set — a bar closer to the green 'human' bar indicates less length-bias.</w:t>
       </w:r>
     </w:p>
     <w:p>

</xml_diff>